<commit_message>
feat: release v1566 role WeChat sync and role phone appearance
</commit_message>
<xml_diff>
--- a/docs/maintenance/AI开发项目_新聊天启动说明.docx
+++ b/docs/maintenance/AI开发项目_新聊天启动说明.docx
@@ -6456,6 +6456,36 @@
     <w:p>
       <w:r>
         <w:t>2026-10-05 用户授权本轮网页推送：发布候选网页v1554、私人共享源码v1555；iOS439/桥42不变且未打包。切换账号整页包含密码验证后快捷切换及解绑；移除日常事件簿的入口、独立组件、模型读写和加载清单，保留小事簿、普通记忆与聊天。3203项回归及网页/私人真实入口授权聊天检查通过，浏览器已实点解绑后重新要求密码。发布提交和Pages结果以Git及部署记录为准，Windows检查不代表Mac/iPhone验收。</w:t>
+      </w:r>
+    </w:p>
+    <w:p>
+      <w:r>
+        <w:t>2026-10-05 本地查角色手机桌面装修（用户要求先截图预览，未提交/推送/打包）：spyHome采用独立封面、重叠圆形头像、可编辑显示名及手动刷新时同请求生成的messageToYou（角色今天想对用户说的话），普通打开不增加模型请求。角色地区沿用既有手机模拟location，不宣称真实GPS；c._spyAppearance独立保存封面/头像/壁纸/显示名，图片压缩并走已有图片持久化，S.spy刷新或重置不覆盖外观。设置保留原密码/手机号逻辑并新增壁纸更换/恢复及外观操作，原重置存档入口迁到设置，仍需确认。15个原应用全部保留，12+3两页，CSS scroll-snap与局部圆点更新不重建页面，返回/重绘恢复分页。glass-theme.css仅新增spy作用域，按既定iMessage磨砂实体与0.8px遮罩高光环分层，无整块白雾，不修改原短信气泡。root/private窄范围函数与样式同步。3207/3207回归、双入口授权正常聊天（HTTP模拟）通过，实际浏览器分页/设置/名字编辑已检查。图片与名称演示夹具只在内存，不修改用户存档。并行聊天更新共享候选v1556/1557，本轮补齐相应测试版本断言与私人repair链接标记，未改iOS439/桥42。Mac/iPhone触控与材质未验证。</w:t>
+      </w:r>
+    </w:p>
+    <w:p>
+      <w:r>
+        <w:t>角色手机桌面修正（2026-10-05，仅本地预览）：第一页上方8个应用，第二页3个应用；原序第9至12个应用位于独立磨砂底栏，两页共用。15个应用入口保留。预览壁纸原为330×192旅游缩略图，改用现有941×1672竖图assets/pet-room-v1.webp；正式封面/壁纸上传复用compressChatBackground，优先2600/.93，超过300万字符时按既有2200/.88、1800/.84处理，头像512/.9。已保存低清图片须重新选择原图。专项10/10通过；实际网页及私人HTML正常授权聊天回归通过，pageErrors=0；浏览器确认8+4布局、第二页设置入口。全量3208项中3161通过、47失败，运行时共享工作区版本已由其他工作推进到1560，旧版1556/1557断言尚未同步；不可写为全量通过。未提交、未推送、未打包，无Mac/真机验证。截图复用.codex_tmp/spy-access-card/desktop.jpg；预览改至http://localhost:8777/theme-real-preview.html?page=spy-home，替换本任务原8776服务以避免旧缓存，未停止其他服务。</w:t>
+      </w:r>
+    </w:p>
+    <w:p>
+      <w:r>
+        <w:t>角色手机外观微调（2026-10-05，仅本地）：按用户反馈去掉中间圆形头像容器底色、外圈及阴影，头像和更换入口保留；底部应用框及四个图标减淡底色和阴影，降低重复磨砂叠加形成的灰感。只改网页/私人glass-theme.css对应规则，规则一致；浏览器计算样式确认头像两层background为透明、box-shadow为none，第二页scroll页码为1。第一页8个、第二页3个，底栏4个不变。截图desktop.jpg及desktop-page2.jpg位于.codex_tmp/spy-access-card；预览http://localhost:8778/theme-real-preview.html?page=spy-home替换本任务8777服务。此轮未修改业务逻辑，未新增测试、提交、推送或打包；无Mac/真机验证。</w:t>
+      </w:r>
+    </w:p>
+    <w:p>
+      <w:r>
+        <w:t>角色手机头像圈与重置入口修正（2026-10-05，本地预览）：恢复头像1px细白圆圈，头像框固定92×92，内部透明无底色；重置存档从角色手机设置移至第二页应用区下方，复用原spyReset及确认步骤。原函数仍仅删除当前角色S.spy[id]，不动聊天/记忆/角色外观。专项10/10通过，浏览器确认圆圈尺寸与透明底色；点击重置展示确认，取消后原内容仍在，未执行真实重置。网页/私人对应改动同步，截图复用desktop.jpg、desktop-page2.jpg；当前本任务预览http://localhost:8779/theme-real-preview.html?page=spy-home（替换8778本任务服务避开旧缓存）。未提交、推送、打包，无Mac/真机验证；上轮共享工作区版本断言阻塞仍不得称全量通过。</w:t>
+      </w:r>
+    </w:p>
+    <w:p>
+      <w:r>
+        <w:t xml:space="preserve">2026-10-05 发布候选网页v1566 / 私人共享源码v1567：用户授权统一推送。角色微信复用首页、通讯录、发现、我、朋友圈、服务/钱包/收藏/相册与聊天外观；图片/表情/付款给玩家自己共用真实聊天记录，角色钱包和查手机同源，领取/退还幂等，独立付款账本保留删卡后的待领取金额。仅隐藏气泡下“你冒充发的”可见字样，内部_forged身份及普通/无痕退出发现逻辑保留，提示含媒体类型和金额。另一个聊天已完成的角色手机桌面8+3应用与4个固定底栏、独立封面/头像/壁纸/名字、细白头像圈、第二页重置入口一并带上。版本旧断言同步为最终候选，业务断言保留。旧工作区候选和公版工程未整份迁移，永久继承门禁核对先前交付修复。实际提交/推送/Pages以Git与部署证据为准；iOS439/桥42不变，未打包，未Mac或真机验收。</w:t>
+      </w:r>
+    </w:p>
+    <w:p>
+      <w:r>
+        <w:t xml:space="preserve">2026-10-05 v1566/v1567 最终发布核验：3219/3219完整Node回归通过，0失败；网页/私人实际入口授权聊天矩阵、自动检查、持久化回归通过，pageErrors=0。实际Edge双入口验证隐藏可见冒充字样但保留真实模型上下文中的代操作类型/金额；角色转账/红包扣角色余额，玩家领取幂等、图片文件上传进入玩家共用聊天；并行角色手机15个应用保留。六项初次完整门禁失败定位为旧repair版本/旧Mac指南及渲染入口形状断言；对齐修复页与指南，付款过期检查放在既有渲染计时入口之后，保持原性能入口与所有业务断言；重跑全量通过。未Mac/Xcode、真实模型或iPhone验证，未打包。</w:t>
       </w:r>
     </w:p>
     <w:sectPr>

</xml_diff>

<commit_message>
fix: release v1568 inline role phone names and location alignment
</commit_message>
<xml_diff>
--- a/docs/maintenance/AI开发项目_新聊天启动说明.docx
+++ b/docs/maintenance/AI开发项目_新聊天启动说明.docx
@@ -6486,6 +6486,16 @@
     <w:p>
       <w:r>
         <w:t xml:space="preserve">2026-10-05 v1566/v1567 最终发布核验：3219/3219完整Node回归通过，0失败；网页/私人实际入口授权聊天矩阵、自动检查、持久化回归通过，pageErrors=0。实际Edge双入口验证隐藏可见冒充字样但保留真实模型上下文中的代操作类型/金额；角色转账/红包扣角色余额，玩家领取幂等、图片文件上传进入玩家共用聊天；并行角色手机15个应用保留。六项初次完整门禁失败定位为旧repair版本/旧Mac指南及渲染入口形状断言；对齐修复页与指南，付款过期检查放在既有渲染计时入口之后，保持原性能入口与所有业务断言；重跑全量通过。未Mac/Xcode、真实模型或iPhone验证，未打包。</w:t>
+      </w:r>
+    </w:p>
+    <w:p>
+      <w:r>
+        <w:t>角色手机显示名字原地编辑（2026-10-05，本地未提交未推送）：用户要求取消改名弹窗。spyAppearanceName替换卡片名字按钮为透明内联input，按Enter/完成或失焦保存；Escape取消，空白输入恢复原名字，不重复保存相同值。设置内“修改显示名字”返回卡片后进入同一编辑入口。仅保存当前角色_spyAppearance.name，不改角色资料名或其他角色。网页/私人对应函数一致。地址图标第一行对齐修正同在此候选。专项11/11、全量3220/3220通过；真实网页/私人HTML正常授权聊天HTTP模拟回归通过，pageErrors=0。浏览器验证原地输入无弹窗，Enter及点击其他区域均更新卡片/顶部标题。预览8781替换本任务8780服务；编辑截图复用.codex_tmp/spy-access-card/desktop.jpg。没有Mac/真机或正式重启存储验证。README记录完成，既有3份DOCX XML解析异常不在本轮修复范围，未覆盖异常文档。</w:t>
+      </w:r>
+    </w:p>
+    <w:p>
+      <w:r>
+        <w:t>2026-10-05 用户授权发布：网页v1568/私人共享源码v1569，iOS439/桥42不变，不打包。范围为角色手机多行地址定位图标对齐第一行、显示名字在卡片内直接编辑并通过完成/失焦保存，空白恢复、Escape取消；沿用角色独立外观，不改聊天/记忆或原角色资料名。3222/3222全量测试通过，网页/私人正式HTML授权正常聊天HTTP模拟检查通过，pageErrors=0；浏览器实际改名完成及失焦保存通过。原线上v1566和基线030ca9ca逐字节核对一致，远端0/0；正式推送与部署以Git/线上记录为准。只stage明确拥有的功能文件、版本入口及版本测试，不包含既有14份仅行尾现场；既有3份不可解析DOCX保留未覆盖，记录写入README及可读取的启动说明。私人CSS既有性能保护不同，保留原差异，仅核对角色手机区域一致。未Mac/真机验收。</w:t>
       </w:r>
     </w:p>
     <w:sectPr>

</xml_diff>

<commit_message>
fix: release v1570 role WeChat bubble sync and glass phone keypad
</commit_message>
<xml_diff>
--- a/docs/maintenance/AI开发项目_新聊天启动说明.docx
+++ b/docs/maintenance/AI开发项目_新聊天启动说明.docx
@@ -6496,6 +6496,26 @@
     <w:p>
       <w:r>
         <w:t>2026-10-05 用户授权发布：网页v1568/私人共享源码v1569，iOS439/桥42不变，不打包。范围为角色手机多行地址定位图标对齐第一行、显示名字在卡片内直接编辑并通过完成/失焦保存，空白恢复、Escape取消；沿用角色独立外观，不改聊天/记忆或原角色资料名。3222/3222全量测试通过，网页/私人正式HTML授权正常聊天HTTP模拟检查通过，pageErrors=0；浏览器实际改名完成及失焦保存通过。原线上v1566和基线030ca9ca逐字节核对一致，远端0/0；正式推送与部署以Git/线上记录为准。只stage明确拥有的功能文件、版本入口及版本测试，不包含既有14份仅行尾现场；既有3份不可解析DOCX保留未覆盖，记录写入README及可读取的启动说明。私人CSS既有性能保护不同，保留原差异，仅核对角色手机区域一致。未Mac/真机验收。</w:t>
+      </w:r>
+    </w:p>
+    <w:p>
+      <w:r>
+        <w:t>查角色手机密码拨号盘液态磨砂预览（2026-10-05，本地未提交/未推送）：spyLockScreen复用.spy-desktop/.spy-glass，数字、取消、删除共12个按键采用更实的rgba(65,92,110,.62)磨砂实体与0.8px遮罩高光环，圆形头像沿用原IDB恢复并优先角色自定义头像。新增当前角色_spyAppearance.lockWallpaper，设置内独立更换/恢复，使用既有compressChatBackground清晰度与容量退让，不覆盖桌面wallpaper、cover、avatar及其他角色；默认单独渐变背景，不偷改桌面背景。spyPin/spyPinDel密码验证、三次错误一分钟锁定、角色察觉及原取消入口保留。专项20/20、全量3224/3224通过，网页/私人真实HTML正常授权聊天HTTP模拟回归pageErrors=0。浏览器实际数字1234解锁成功、选择背景文件、恢复默认入口检查通过。截图复用.codex_tmp/spy-access-card/desktop.jpg（拨号盘）及desktop-page2.jpg（设置区域）；预览http://localhost:8782/theme-real-preview.html?page=spy-lock替换本任务8781服务，测试密码1234仅内存演示。未正式存档重启、Mac/Xcode或真机验证。按用户要求先预览，未版本发布、打包或推送；现有三份不可解析DOCX未覆盖，记录写入README及可读取的启动说明。</w:t>
+      </w:r>
+    </w:p>
+    <w:p>
+      <w:r>
+        <w:t xml:space="preserve">2026-10-05 本地角色微信气泡同步修复（网页候选v1570 / 私人源码v1571，未提交、未推送、未打包）：hisChatMessageHTML此前把bubbleSingleHTML样式传null，登录角色微信一直使用默认气泡。现复用bubbleLook/bubbleIconFor/bubbleAvatarClass及bubbleCfg现有角色设置，按作者归属取样式：登录角色发送在右侧仍用them设置，玩家或对方在左侧用me设置；角色独立设置优先，无角色设置沿用现有全局回退，恢复默认立即跟随。只改变文字/现有文字显示的气泡外观与配置内头像形状，不改媒体/付款独立卡片、聊天/代发标记/模型请求/钱包数据。原设置读写不改，没有复制第二份样式。双端实际Edge验证颜色、指定文字色、圆角、图标、发光、头像圆形、浅深色、动态更新、全局回退与恢复默认通过，正常聊天样式保持，pageErrors=0；9项气泡/角色好友回归通过。其他聊天角色拨号盘/锁屏候选及原14项行尾现场保留，未清理共享资料。Mac/iPhone未验证。</w:t>
+      </w:r>
+    </w:p>
+    <w:p>
+      <w:r>
+        <w:t>2026-10-05 角色密码拨号盘外观二次修正（仅本地预览）：10个数字键去掉固定蓝灰填充，透明本体加blur(18px)/saturate(1.5)/brightness(.82)，保留现有细高光圆环；取消与删除独立为无背景、无边框、无模糊的文字/图标，原点击与锁定规则保留。网页/私人对应片段同步。专项13/13通过；浏览器实际输入、删除与1234解锁通过；正常授权聊天实际网页/私人HTML回归通过，pageErrors=0。全量本次3225项中3207通过、18失败，日志显示发布版本断言仍期待1568，但共享工作区已出现其他任务1570/1571版本候选，未修改其他任务版本或测试以强行通过。截图复用.codex_tmp/spy-access-card/desktop.jpg，预览localhost:8783/theme-real-preview.html?page=spy-lock。未提交、未推送、未打包，无Mac/真机证据。</w:t>
+      </w:r>
+    </w:p>
+    <w:p>
+      <w:r>
+        <w:t xml:space="preserve">2026-10-05 用户授权统一发布网页v1570 / 私人共享源码v1571，iOS439/桥42不变，未打包：角色微信气泡按实际作者同步角色配置，左右换位不换颜色/圆角/装饰/字体/头像形状，独立设置及全局回退、恢复默认即时跟随；角色手机密码拨号盘和独立背景设置、10个透明液态磨砂数字键、无底色取消/删除一并发布，密码校验、删除、锁定与存档隔离保留。既有原地改名、定位图标对齐及全部交付修复继承。3229/3229完整Node回归、网页/私人实际HTML授权聊天HTTP模拟检查通过，pageErrors=0；实际Edge双入口角色气泡、透明材质及正确密码解锁通过。初次全量18项及随后1项失败均为当前版shell/cache版本断言仍保留1568/1569，精确同步身份断言后全量通过，没有移除业务检查。3份维护DOCX此前追加代码错误假设w前缀，实际为ns0，导致段落插入到文档闭合标签中；现恢复原闭合标签并把所有新增段落放到已有正文末尾section之前，逐项核对原文本与全部追加文本不丢失，其余DOCX parts不变。四份XML已解析通过，未宣称Word视觉渲染。以后追加先读实际namespace和body结构并验证XML，禁止仅用rfind固定w前缀。仅提交审核后的内容变化，原14个行尾现场及其它工作树候选保留，必要证据保留，没有可安全丢弃的新临时文件。实际推送/Pages以Git及线上核验为准；未真实模型、Mac或iPhone验收。</w:t>
       </w:r>
     </w:p>
     <w:sectPr>

</xml_diff>